<commit_message>
feat(knowledge): 真实模型评测落地（R-LLM-01 real / R-KN-06 real，DeepSeek deepseek-chat）
- ontology-llm-eval --real：双通道对照——规则 top-20 11/20、关系 1/7（与 R-KN-02
  对账一致）；LLM 合并列表 9/20、关系 1/7（命中'海漂垃圾→机械臂'）；纯 LLM 候选
  命中全部 7 个核心领域词；负结果如实报告（合成语料上 LLM 未跑赢规则先验）
- knowledge-llm-qa-trace --real：真实模型生成式问答——接地回答带 [c:1] 引用，
  漏油问题明示 insufficient_evidence=true 并列出四类证据缺口（与 R-NX-09 同叙事）
- 评测脚本补 llm_pure 口径；推理模型 deepseek-v4-pro 空 content 问题经
  deepseek-chat（非推理档）解决
- scoring-review 升 v3.5：2.2 18→19，总分 78→79；材料2 §3.4/§六真模型口径；
  提交包 47 entries 重建，宣称门禁 exit 0
- R-NX-08 第二次探测仍 401（API Key 服务端拒绝），控制台核验仍为 user 侧待办
</commit_message>
<xml_diff>
--- a/项目文档/华为ICT赛道三_Nexent智能体设计说明.docx
+++ b/项目文档/华为ICT赛道三_Nexent智能体设计说明.docx
@@ -5510,35 +5510,7 @@
           <w:rFonts w:ascii="Microsoft YaHei" w:hAnsi="Microsoft YaHei" w:eastAsia="Microsoft YaHei"/>
           <w:sz w:val="21"/>
         </w:rPr>
-        <w:t>通道机制由 20 项专项测试与确定性评测守卫（</w:t>
-      </w:r>
-      <w:r>
-        <w:rPr>
-          <w:rFonts w:ascii="Consolas" w:hAnsi="Consolas" w:eastAsia="Microsoft YaHei"/>
-          <w:sz w:val="20"/>
-        </w:rPr>
-        <w:t>make ontology-llm-eval</w:t>
-      </w:r>
-      <w:r>
-        <w:rPr>
-          <w:rFonts w:ascii="Microsoft YaHei" w:hAnsi="Microsoft YaHei" w:eastAsia="Microsoft YaHei"/>
-          <w:sz w:val="21"/>
-        </w:rPr>
-        <w:t xml:space="preserve"> / </w:t>
-      </w:r>
-      <w:r>
-        <w:rPr>
-          <w:rFonts w:ascii="Consolas" w:hAnsi="Consolas" w:eastAsia="Microsoft YaHei"/>
-          <w:sz w:val="20"/>
-        </w:rPr>
-        <w:t>make knowledge-llm-qa-trace</w:t>
-      </w:r>
-      <w:r>
-        <w:rPr>
-          <w:rFonts w:ascii="Microsoft YaHei" w:hAnsi="Microsoft YaHei" w:eastAsia="Microsoft YaHei"/>
-          <w:sz w:val="21"/>
-        </w:rPr>
-        <w:t>）；</w:t>
+        <w:t>通道机制由 20 项专项测试与确定性评测守卫；</w:t>
       </w:r>
       <w:r>
         <w:rPr>
@@ -5546,14 +5518,405 @@
           <w:b/>
           <w:sz w:val="21"/>
         </w:rPr>
-        <w:t>当前已采集轨迹均来自确定性脚本客户端， 真实模型评测须配置端点后加 `--real` 重跑</w:t>
+        <w:t>2026-10-24 深夜已配真实端点并完成 真模型评测（R-LLM-01 real / R-KN-06 real，DeepSeek `deepseek-chat`）</w:t>
       </w:r>
       <w:r>
         <w:rPr>
           <w:rFonts w:ascii="Microsoft YaHei" w:hAnsi="Microsoft YaHei" w:eastAsia="Microsoft YaHei"/>
           <w:sz w:val="21"/>
         </w:rPr>
-        <w:t>，不得把脚本客户端表述为模型能力。</w:t>
+        <w:t>：</w:t>
+      </w:r>
+    </w:p>
+    <w:tbl>
+      <w:tblPr>
+        <w:tblW w:type="auto" w:w="0"/>
+        <w:jc w:val="center"/>
+        <w:tblLayout w:type="fixed"/>
+        <w:tblLook w:firstColumn="1" w:firstRow="1" w:lastColumn="0" w:lastRow="0" w:noHBand="0" w:noVBand="1" w:val="04A0"/>
+      </w:tblPr>
+      <w:tblGrid>
+        <w:gridCol w:w="3331"/>
+        <w:gridCol w:w="3331"/>
+        <w:gridCol w:w="3331"/>
+      </w:tblGrid>
+      <w:tr>
+        <w:trPr>
+          <w:cantSplit w:val="true"/>
+          <w:tblHeader w:val="true"/>
+        </w:trPr>
+        <w:tc>
+          <w:tcPr>
+            <w:tcW w:type="dxa" w:w="3331"/>
+            <w:vAlign w:val="center"/>
+            <w:tcMar>
+              <w:top w:w="38" w:type="dxa"/>
+              <w:start w:w="70" w:type="dxa"/>
+              <w:bottom w:w="38" w:type="dxa"/>
+              <w:end w:w="70" w:type="dxa"/>
+            </w:tcMar>
+            <w:tcBorders>
+              <w:top w:val="single" w:sz="6" w:space="0" w:color="D9D9D9"/>
+              <w:left w:val="single" w:sz="6" w:space="0" w:color="D9D9D9"/>
+              <w:bottom w:val="single" w:sz="6" w:space="0" w:color="D9D9D9"/>
+              <w:right w:val="single" w:sz="6" w:space="0" w:color="D9D9D9"/>
+              <w:insideH w:val="single" w:sz="6" w:space="0" w:color="D9D9D9"/>
+              <w:insideV w:val="single" w:sz="6" w:space="0" w:color="D9D9D9"/>
+            </w:tcBorders>
+            <w:shd w:fill="1F4E79"/>
+          </w:tcPr>
+          <w:p>
+            <w:pPr>
+              <w:spacing w:after="0" w:line="252" w:lineRule="auto"/>
+              <w:jc w:val="center"/>
+            </w:pPr>
+            <w:r>
+              <w:rPr>
+                <w:rFonts w:ascii="Microsoft YaHei" w:hAnsi="Microsoft YaHei" w:eastAsia="Microsoft YaHei"/>
+                <w:b/>
+                <w:color w:val="FFFFFF"/>
+                <w:sz w:val="17"/>
+              </w:rPr>
+              <w:t>评测</w:t>
+            </w:r>
+          </w:p>
+        </w:tc>
+        <w:tc>
+          <w:tcPr>
+            <w:tcW w:type="dxa" w:w="3331"/>
+            <w:vAlign w:val="center"/>
+            <w:tcMar>
+              <w:top w:w="38" w:type="dxa"/>
+              <w:start w:w="70" w:type="dxa"/>
+              <w:bottom w:w="38" w:type="dxa"/>
+              <w:end w:w="70" w:type="dxa"/>
+            </w:tcMar>
+            <w:tcBorders>
+              <w:top w:val="single" w:sz="6" w:space="0" w:color="D9D9D9"/>
+              <w:left w:val="single" w:sz="6" w:space="0" w:color="D9D9D9"/>
+              <w:bottom w:val="single" w:sz="6" w:space="0" w:color="D9D9D9"/>
+              <w:right w:val="single" w:sz="6" w:space="0" w:color="D9D9D9"/>
+              <w:insideH w:val="single" w:sz="6" w:space="0" w:color="D9D9D9"/>
+              <w:insideV w:val="single" w:sz="6" w:space="0" w:color="D9D9D9"/>
+            </w:tcBorders>
+            <w:shd w:fill="1F4E79"/>
+          </w:tcPr>
+          <w:p>
+            <w:pPr>
+              <w:spacing w:after="0" w:line="252" w:lineRule="auto"/>
+              <w:jc w:val="center"/>
+            </w:pPr>
+            <w:r>
+              <w:rPr>
+                <w:rFonts w:ascii="Microsoft YaHei" w:hAnsi="Microsoft YaHei" w:eastAsia="Microsoft YaHei"/>
+                <w:b/>
+                <w:color w:val="FFFFFF"/>
+                <w:sz w:val="17"/>
+              </w:rPr>
+              <w:t>真实数字</w:t>
+            </w:r>
+          </w:p>
+        </w:tc>
+        <w:tc>
+          <w:tcPr>
+            <w:tcW w:type="dxa" w:w="3331"/>
+            <w:vAlign w:val="center"/>
+            <w:tcMar>
+              <w:top w:w="38" w:type="dxa"/>
+              <w:start w:w="70" w:type="dxa"/>
+              <w:bottom w:w="38" w:type="dxa"/>
+              <w:end w:w="70" w:type="dxa"/>
+            </w:tcMar>
+            <w:tcBorders>
+              <w:top w:val="single" w:sz="6" w:space="0" w:color="D9D9D9"/>
+              <w:left w:val="single" w:sz="6" w:space="0" w:color="D9D9D9"/>
+              <w:bottom w:val="single" w:sz="6" w:space="0" w:color="D9D9D9"/>
+              <w:right w:val="single" w:sz="6" w:space="0" w:color="D9D9D9"/>
+              <w:insideH w:val="single" w:sz="6" w:space="0" w:color="D9D9D9"/>
+              <w:insideV w:val="single" w:sz="6" w:space="0" w:color="D9D9D9"/>
+            </w:tcBorders>
+            <w:shd w:fill="1F4E79"/>
+          </w:tcPr>
+          <w:p>
+            <w:pPr>
+              <w:spacing w:after="0" w:line="252" w:lineRule="auto"/>
+              <w:jc w:val="center"/>
+            </w:pPr>
+            <w:r>
+              <w:rPr>
+                <w:rFonts w:ascii="Microsoft YaHei" w:hAnsi="Microsoft YaHei" w:eastAsia="Microsoft YaHei"/>
+                <w:b/>
+                <w:color w:val="FFFFFF"/>
+                <w:sz w:val="17"/>
+              </w:rPr>
+              <w:t>口径</w:t>
+            </w:r>
+          </w:p>
+        </w:tc>
+      </w:tr>
+      <w:tr>
+        <w:trPr>
+          <w:cantSplit w:val="true"/>
+        </w:trPr>
+        <w:tc>
+          <w:tcPr>
+            <w:tcW w:type="dxa" w:w="3331"/>
+            <w:vAlign w:val="center"/>
+            <w:tcMar>
+              <w:top w:w="38" w:type="dxa"/>
+              <w:start w:w="70" w:type="dxa"/>
+              <w:bottom w:w="38" w:type="dxa"/>
+              <w:end w:w="70" w:type="dxa"/>
+            </w:tcMar>
+            <w:tcBorders>
+              <w:top w:val="single" w:sz="6" w:space="0" w:color="D9D9D9"/>
+              <w:left w:val="single" w:sz="6" w:space="0" w:color="D9D9D9"/>
+              <w:bottom w:val="single" w:sz="6" w:space="0" w:color="D9D9D9"/>
+              <w:right w:val="single" w:sz="6" w:space="0" w:color="D9D9D9"/>
+              <w:insideH w:val="single" w:sz="6" w:space="0" w:color="D9D9D9"/>
+              <w:insideV w:val="single" w:sz="6" w:space="0" w:color="D9D9D9"/>
+            </w:tcBorders>
+          </w:tcPr>
+          <w:p>
+            <w:pPr>
+              <w:spacing w:after="0" w:line="252" w:lineRule="auto"/>
+              <w:jc w:val="left"/>
+            </w:pPr>
+            <w:r>
+              <w:rPr>
+                <w:rFonts w:ascii="Microsoft YaHei" w:hAnsi="Microsoft YaHei" w:eastAsia="Microsoft YaHei"/>
+                <w:color w:val="000000"/>
+                <w:sz w:val="17"/>
+              </w:rPr>
+              <w:t>双通道抽取对照（R-LLM-01 real）</w:t>
+            </w:r>
+          </w:p>
+        </w:tc>
+        <w:tc>
+          <w:tcPr>
+            <w:tcW w:type="dxa" w:w="3331"/>
+            <w:vAlign w:val="center"/>
+            <w:tcMar>
+              <w:top w:w="38" w:type="dxa"/>
+              <w:start w:w="70" w:type="dxa"/>
+              <w:bottom w:w="38" w:type="dxa"/>
+              <w:end w:w="70" w:type="dxa"/>
+            </w:tcMar>
+            <w:tcBorders>
+              <w:top w:val="single" w:sz="6" w:space="0" w:color="D9D9D9"/>
+              <w:left w:val="single" w:sz="6" w:space="0" w:color="D9D9D9"/>
+              <w:bottom w:val="single" w:sz="6" w:space="0" w:color="D9D9D9"/>
+              <w:right w:val="single" w:sz="6" w:space="0" w:color="D9D9D9"/>
+              <w:insideH w:val="single" w:sz="6" w:space="0" w:color="D9D9D9"/>
+              <w:insideV w:val="single" w:sz="6" w:space="0" w:color="D9D9D9"/>
+            </w:tcBorders>
+          </w:tcPr>
+          <w:p>
+            <w:pPr>
+              <w:spacing w:after="0" w:line="252" w:lineRule="auto"/>
+              <w:jc w:val="left"/>
+            </w:pPr>
+            <w:r>
+              <w:rPr>
+                <w:rFonts w:ascii="Microsoft YaHei" w:hAnsi="Microsoft YaHei" w:eastAsia="Microsoft YaHei"/>
+                <w:color w:val="000000"/>
+                <w:sz w:val="17"/>
+              </w:rPr>
+              <w:t>规则 top-20 术语 11/20、关系 1/7（与 R-KN-02 对账一致）；LLM 合并列表 9/20、关系 1/7（命中"海漂垃圾→机械臂"）；纯 LLM 候选命中全部 7 个核心领域词，漏乡镇/动作词</w:t>
+            </w:r>
+          </w:p>
+        </w:tc>
+        <w:tc>
+          <w:tcPr>
+            <w:tcW w:type="dxa" w:w="3331"/>
+            <w:vAlign w:val="center"/>
+            <w:tcMar>
+              <w:top w:w="38" w:type="dxa"/>
+              <w:start w:w="70" w:type="dxa"/>
+              <w:bottom w:w="38" w:type="dxa"/>
+              <w:end w:w="70" w:type="dxa"/>
+            </w:tcMar>
+            <w:tcBorders>
+              <w:top w:val="single" w:sz="6" w:space="0" w:color="D9D9D9"/>
+              <w:left w:val="single" w:sz="6" w:space="0" w:color="D9D9D9"/>
+              <w:bottom w:val="single" w:sz="6" w:space="0" w:color="D9D9D9"/>
+              <w:right w:val="single" w:sz="6" w:space="0" w:color="D9D9D9"/>
+              <w:insideH w:val="single" w:sz="6" w:space="0" w:color="D9D9D9"/>
+              <w:insideV w:val="single" w:sz="6" w:space="0" w:color="D9D9D9"/>
+            </w:tcBorders>
+          </w:tcPr>
+          <w:p>
+            <w:pPr>
+              <w:spacing w:after="0" w:line="252" w:lineRule="auto"/>
+              <w:jc w:val="left"/>
+            </w:pPr>
+            <w:r>
+              <w:rPr>
+                <w:rFonts w:ascii="Microsoft YaHei" w:hAnsi="Microsoft YaHei" w:eastAsia="Microsoft YaHei"/>
+                <w:color w:val="000000"/>
+                <w:sz w:val="17"/>
+              </w:rPr>
+              <w:t>内部合成语料（E1）；</w:t>
+            </w:r>
+            <w:r>
+              <w:rPr>
+                <w:rFonts w:ascii="Microsoft YaHei" w:hAnsi="Microsoft YaHei" w:eastAsia="Microsoft YaHei"/>
+                <w:b/>
+                <w:color w:val="000000"/>
+                <w:sz w:val="17"/>
+              </w:rPr>
+              <w:t>负结果如实报告</w:t>
+            </w:r>
+            <w:r>
+              <w:rPr>
+                <w:rFonts w:ascii="Microsoft YaHei" w:hAnsi="Microsoft YaHei" w:eastAsia="Microsoft YaHei"/>
+                <w:color w:val="000000"/>
+                <w:sz w:val="17"/>
+              </w:rPr>
+              <w:t>：本语料上 LLM 未跑赢手调规则先验，价值在零样本扩展与引文证据</w:t>
+            </w:r>
+          </w:p>
+        </w:tc>
+      </w:tr>
+      <w:tr>
+        <w:trPr>
+          <w:cantSplit w:val="true"/>
+        </w:trPr>
+        <w:tc>
+          <w:tcPr>
+            <w:tcW w:type="dxa" w:w="3331"/>
+            <w:vAlign w:val="center"/>
+            <w:tcMar>
+              <w:top w:w="38" w:type="dxa"/>
+              <w:start w:w="70" w:type="dxa"/>
+              <w:bottom w:w="38" w:type="dxa"/>
+              <w:end w:w="70" w:type="dxa"/>
+            </w:tcMar>
+            <w:tcBorders>
+              <w:top w:val="single" w:sz="6" w:space="0" w:color="D9D9D9"/>
+              <w:left w:val="single" w:sz="6" w:space="0" w:color="D9D9D9"/>
+              <w:bottom w:val="single" w:sz="6" w:space="0" w:color="D9D9D9"/>
+              <w:right w:val="single" w:sz="6" w:space="0" w:color="D9D9D9"/>
+              <w:insideH w:val="single" w:sz="6" w:space="0" w:color="D9D9D9"/>
+              <w:insideV w:val="single" w:sz="6" w:space="0" w:color="D9D9D9"/>
+            </w:tcBorders>
+            <w:shd w:fill="F3F7FA"/>
+          </w:tcPr>
+          <w:p>
+            <w:pPr>
+              <w:spacing w:after="0" w:line="252" w:lineRule="auto"/>
+              <w:jc w:val="left"/>
+            </w:pPr>
+            <w:r>
+              <w:rPr>
+                <w:rFonts w:ascii="Microsoft YaHei" w:hAnsi="Microsoft YaHei" w:eastAsia="Microsoft YaHei"/>
+                <w:color w:val="000000"/>
+                <w:sz w:val="17"/>
+              </w:rPr>
+              <w:t>生成式问答（R-KN-06 real）</w:t>
+            </w:r>
+          </w:p>
+        </w:tc>
+        <w:tc>
+          <w:tcPr>
+            <w:tcW w:type="dxa" w:w="3331"/>
+            <w:vAlign w:val="center"/>
+            <w:tcMar>
+              <w:top w:w="38" w:type="dxa"/>
+              <w:start w:w="70" w:type="dxa"/>
+              <w:bottom w:w="38" w:type="dxa"/>
+              <w:end w:w="70" w:type="dxa"/>
+            </w:tcMar>
+            <w:tcBorders>
+              <w:top w:val="single" w:sz="6" w:space="0" w:color="D9D9D9"/>
+              <w:left w:val="single" w:sz="6" w:space="0" w:color="D9D9D9"/>
+              <w:bottom w:val="single" w:sz="6" w:space="0" w:color="D9D9D9"/>
+              <w:right w:val="single" w:sz="6" w:space="0" w:color="D9D9D9"/>
+              <w:insideH w:val="single" w:sz="6" w:space="0" w:color="D9D9D9"/>
+              <w:insideV w:val="single" w:sz="6" w:space="0" w:color="D9D9D9"/>
+            </w:tcBorders>
+            <w:shd w:fill="F3F7FA"/>
+          </w:tcPr>
+          <w:p>
+            <w:pPr>
+              <w:spacing w:after="0" w:line="252" w:lineRule="auto"/>
+              <w:jc w:val="left"/>
+            </w:pPr>
+            <w:r>
+              <w:rPr>
+                <w:rFonts w:ascii="Microsoft YaHei" w:hAnsi="Microsoft YaHei" w:eastAsia="Microsoft YaHei"/>
+                <w:color w:val="000000"/>
+                <w:sz w:val="17"/>
+              </w:rPr>
+              <w:t xml:space="preserve">接地问题按检索证据回答并标 [c:1]；漏油问题明示 </w:t>
+            </w:r>
+            <w:r>
+              <w:rPr>
+                <w:rFonts w:ascii="Consolas" w:hAnsi="Consolas" w:eastAsia="Microsoft YaHei"/>
+                <w:color w:val="000000"/>
+                <w:sz w:val="16"/>
+              </w:rPr>
+              <w:t>insufficient_evidence=true</w:t>
+            </w:r>
+            <w:r>
+              <w:rPr>
+                <w:rFonts w:ascii="Microsoft YaHei" w:hAnsi="Microsoft YaHei" w:eastAsia="Microsoft YaHei"/>
+                <w:color w:val="000000"/>
+                <w:sz w:val="17"/>
+              </w:rPr>
+              <w:t xml:space="preserve"> 并列出四类证据缺口（应急预案/上报流程/围油栏吸油材料/监测取证）</w:t>
+            </w:r>
+          </w:p>
+        </w:tc>
+        <w:tc>
+          <w:tcPr>
+            <w:tcW w:type="dxa" w:w="3331"/>
+            <w:vAlign w:val="center"/>
+            <w:tcMar>
+              <w:top w:w="38" w:type="dxa"/>
+              <w:start w:w="70" w:type="dxa"/>
+              <w:bottom w:w="38" w:type="dxa"/>
+              <w:end w:w="70" w:type="dxa"/>
+            </w:tcMar>
+            <w:tcBorders>
+              <w:top w:val="single" w:sz="6" w:space="0" w:color="D9D9D9"/>
+              <w:left w:val="single" w:sz="6" w:space="0" w:color="D9D9D9"/>
+              <w:bottom w:val="single" w:sz="6" w:space="0" w:color="D9D9D9"/>
+              <w:right w:val="single" w:sz="6" w:space="0" w:color="D9D9D9"/>
+              <w:insideH w:val="single" w:sz="6" w:space="0" w:color="D9D9D9"/>
+              <w:insideV w:val="single" w:sz="6" w:space="0" w:color="D9D9D9"/>
+            </w:tcBorders>
+            <w:shd w:fill="F3F7FA"/>
+          </w:tcPr>
+          <w:p>
+            <w:pPr>
+              <w:spacing w:after="0" w:line="252" w:lineRule="auto"/>
+              <w:jc w:val="left"/>
+            </w:pPr>
+            <w:r>
+              <w:rPr>
+                <w:rFonts w:ascii="Microsoft YaHei" w:hAnsi="Microsoft YaHei" w:eastAsia="Microsoft YaHei"/>
+                <w:color w:val="000000"/>
+                <w:sz w:val="17"/>
+              </w:rPr>
+              <w:t>演示语料（E1）；拒答叙事与 R-NX-09 本地 Nexent 案例一致</w:t>
+            </w:r>
+          </w:p>
+        </w:tc>
+      </w:tr>
+    </w:tbl>
+    <w:p>
+      <w:pPr>
+        <w:spacing w:after="40"/>
+      </w:pPr>
+    </w:p>
+    <w:p>
+      <w:r>
+        <w:rPr>
+          <w:rFonts w:ascii="Microsoft YaHei" w:hAnsi="Microsoft YaHei" w:eastAsia="Microsoft YaHei"/>
+          <w:sz w:val="21"/>
+        </w:rPr>
+        <w:t>脚本客户端轨迹保留为机制验证口径，与真实模型轨迹分开表述，不得混写。</w:t>
       </w:r>
     </w:p>
     <w:p>
@@ -10840,7 +11203,7 @@
           <w:rFonts w:ascii="Microsoft YaHei" w:hAnsi="Microsoft YaHei" w:eastAsia="Microsoft YaHei"/>
           <w:sz w:val="21"/>
         </w:rPr>
-        <w:t xml:space="preserve"> 并建议人工升级——与 R-NX-09 的本地 Nexent 拒答 案例同一叙事。轨迹见 </w:t>
+        <w:t xml:space="preserve"> 并列出四类证据缺口——与 R-NX-09 的本地 Nexent 拒答案例同一叙事。轨迹见 </w:t>
       </w:r>
       <w:r>
         <w:rPr>
@@ -10854,7 +11217,36 @@
           <w:rFonts w:ascii="Microsoft YaHei" w:hAnsi="Microsoft YaHei" w:eastAsia="Microsoft YaHei"/>
           <w:sz w:val="21"/>
         </w:rPr>
-        <w:t>。 口径：确定性脚本客户端（非真实模型），E1；真实模型轨迹待端点配置。</w:t>
+        <w:t xml:space="preserve">， </w:t>
+      </w:r>
+      <w:r>
+        <w:rPr>
+          <w:rFonts w:ascii="Consolas" w:hAnsi="Consolas" w:eastAsia="Microsoft YaHei"/>
+          <w:sz w:val="20"/>
+        </w:rPr>
+        <w:t>mode=real:deepseek-chat</w:t>
+      </w:r>
+      <w:r>
+        <w:rPr>
+          <w:rFonts w:ascii="Microsoft YaHei" w:hAnsi="Microsoft YaHei" w:eastAsia="Microsoft YaHei"/>
+          <w:sz w:val="21"/>
+        </w:rPr>
+        <w:t>（</w:t>
+      </w:r>
+      <w:r>
+        <w:rPr>
+          <w:rFonts w:ascii="Microsoft YaHei" w:hAnsi="Microsoft YaHei" w:eastAsia="Microsoft YaHei"/>
+          <w:b/>
+          <w:sz w:val="21"/>
+        </w:rPr>
+        <w:t>真实模型生成</w:t>
+      </w:r>
+      <w:r>
+        <w:rPr>
+          <w:rFonts w:ascii="Microsoft YaHei" w:hAnsi="Microsoft YaHei" w:eastAsia="Microsoft YaHei"/>
+          <w:sz w:val="21"/>
+        </w:rPr>
+        <w:t>，E1、演示语料）；同文件的脚本 客户端口径仅作机制验证留存，两者分开表述。</w:t>
       </w:r>
     </w:p>
     <w:p>
@@ -13164,7 +13556,7 @@
         </w:trPr>
         <w:tc>
           <w:tcPr>
-            <w:tcW w:type="dxa" w:w="3331"/>
+            <w:tcW w:type="dxa" w:w="1753"/>
             <w:vAlign w:val="center"/>
             <w:tcMar>
               <w:top w:w="38" w:type="dxa"/>
@@ -13200,7 +13592,7 @@
         </w:tc>
         <w:tc>
           <w:tcPr>
-            <w:tcW w:type="dxa" w:w="3331"/>
+            <w:tcW w:type="dxa" w:w="7088"/>
             <w:vAlign w:val="center"/>
             <w:tcMar>
               <w:top w:w="38" w:type="dxa"/>
@@ -13236,7 +13628,7 @@
         </w:tc>
         <w:tc>
           <w:tcPr>
-            <w:tcW w:type="dxa" w:w="3331"/>
+            <w:tcW w:type="dxa" w:w="1152"/>
             <w:vAlign w:val="center"/>
             <w:tcMar>
               <w:top w:w="38" w:type="dxa"/>
@@ -13277,7 +13669,7 @@
         </w:trPr>
         <w:tc>
           <w:tcPr>
-            <w:tcW w:type="dxa" w:w="3331"/>
+            <w:tcW w:type="dxa" w:w="1753"/>
             <w:vAlign w:val="center"/>
             <w:tcMar>
               <w:top w:w="38" w:type="dxa"/>
@@ -13311,7 +13703,7 @@
         </w:tc>
         <w:tc>
           <w:tcPr>
-            <w:tcW w:type="dxa" w:w="3331"/>
+            <w:tcW w:type="dxa" w:w="7088"/>
             <w:vAlign w:val="center"/>
             <w:tcMar>
               <w:top w:w="38" w:type="dxa"/>
@@ -13345,7 +13737,7 @@
         </w:tc>
         <w:tc>
           <w:tcPr>
-            <w:tcW w:type="dxa" w:w="3331"/>
+            <w:tcW w:type="dxa" w:w="1152"/>
             <w:vAlign w:val="center"/>
             <w:tcMar>
               <w:top w:w="38" w:type="dxa"/>
@@ -13384,7 +13776,7 @@
         </w:trPr>
         <w:tc>
           <w:tcPr>
-            <w:tcW w:type="dxa" w:w="3331"/>
+            <w:tcW w:type="dxa" w:w="1753"/>
             <w:vAlign w:val="center"/>
             <w:tcMar>
               <w:top w:w="38" w:type="dxa"/>
@@ -13413,13 +13805,13 @@
                 <w:color w:val="000000"/>
                 <w:sz w:val="17"/>
               </w:rPr>
-              <w:t>2026-09-30</w:t>
+              <w:t>2026-10-24</w:t>
             </w:r>
           </w:p>
         </w:tc>
         <w:tc>
           <w:tcPr>
-            <w:tcW w:type="dxa" w:w="3331"/>
+            <w:tcW w:type="dxa" w:w="7088"/>
             <w:vAlign w:val="center"/>
             <w:tcMar>
               <w:top w:w="38" w:type="dxa"/>
@@ -13448,13 +13840,29 @@
                 <w:color w:val="000000"/>
                 <w:sz w:val="17"/>
               </w:rPr>
-              <w:t>建立「材料 2」独立提交件底稿：整体设计思路、Agent 配置完整细节、Skill 分层编排、调试迭代经验、示例问答截图索引、随附文件说明、托管平台状态与恢复路径、诚实边界</w:t>
+              <w:t xml:space="preserve">§3.4/§六 升级为真模型口径：R-LLM-01 real 双通道对照评测（含负结果）与 R-KN-06 real 真实模型问答轨迹（DeepSeek </w:t>
+            </w:r>
+            <w:r>
+              <w:rPr>
+                <w:rFonts w:ascii="Consolas" w:hAnsi="Consolas" w:eastAsia="Microsoft YaHei"/>
+                <w:color w:val="000000"/>
+                <w:sz w:val="16"/>
+              </w:rPr>
+              <w:t>deepseek-chat</w:t>
+            </w:r>
+            <w:r>
+              <w:rPr>
+                <w:rFonts w:ascii="Microsoft YaHei" w:hAnsi="Microsoft YaHei" w:eastAsia="Microsoft YaHei"/>
+                <w:color w:val="000000"/>
+                <w:sz w:val="17"/>
+              </w:rPr>
+              <w:t>）</w:t>
             </w:r>
           </w:p>
         </w:tc>
         <w:tc>
           <w:tcPr>
-            <w:tcW w:type="dxa" w:w="3331"/>
+            <w:tcW w:type="dxa" w:w="1152"/>
             <w:vAlign w:val="center"/>
             <w:tcMar>
               <w:top w:w="38" w:type="dxa"/>
@@ -13471,6 +13879,113 @@
               <w:insideV w:val="single" w:sz="6" w:space="0" w:color="D9D9D9"/>
             </w:tcBorders>
             <w:shd w:fill="F3F7FA"/>
+          </w:tcPr>
+          <w:p>
+            <w:pPr>
+              <w:spacing w:after="0" w:line="252" w:lineRule="auto"/>
+              <w:jc w:val="left"/>
+            </w:pPr>
+            <w:r>
+              <w:rPr>
+                <w:rFonts w:ascii="Microsoft YaHei" w:hAnsi="Microsoft YaHei" w:eastAsia="Microsoft YaHei"/>
+                <w:color w:val="000000"/>
+                <w:sz w:val="17"/>
+              </w:rPr>
+              <w:t>liyongxiang + ZCode</w:t>
+            </w:r>
+          </w:p>
+        </w:tc>
+      </w:tr>
+      <w:tr>
+        <w:trPr>
+          <w:cantSplit w:val="true"/>
+        </w:trPr>
+        <w:tc>
+          <w:tcPr>
+            <w:tcW w:type="dxa" w:w="1753"/>
+            <w:vAlign w:val="center"/>
+            <w:tcMar>
+              <w:top w:w="38" w:type="dxa"/>
+              <w:start w:w="70" w:type="dxa"/>
+              <w:bottom w:w="38" w:type="dxa"/>
+              <w:end w:w="70" w:type="dxa"/>
+            </w:tcMar>
+            <w:tcBorders>
+              <w:top w:val="single" w:sz="6" w:space="0" w:color="D9D9D9"/>
+              <w:left w:val="single" w:sz="6" w:space="0" w:color="D9D9D9"/>
+              <w:bottom w:val="single" w:sz="6" w:space="0" w:color="D9D9D9"/>
+              <w:right w:val="single" w:sz="6" w:space="0" w:color="D9D9D9"/>
+              <w:insideH w:val="single" w:sz="6" w:space="0" w:color="D9D9D9"/>
+              <w:insideV w:val="single" w:sz="6" w:space="0" w:color="D9D9D9"/>
+            </w:tcBorders>
+          </w:tcPr>
+          <w:p>
+            <w:pPr>
+              <w:spacing w:after="0" w:line="252" w:lineRule="auto"/>
+              <w:jc w:val="left"/>
+            </w:pPr>
+            <w:r>
+              <w:rPr>
+                <w:rFonts w:ascii="Microsoft YaHei" w:hAnsi="Microsoft YaHei" w:eastAsia="Microsoft YaHei"/>
+                <w:color w:val="000000"/>
+                <w:sz w:val="17"/>
+              </w:rPr>
+              <w:t>2026-09-30</w:t>
+            </w:r>
+          </w:p>
+        </w:tc>
+        <w:tc>
+          <w:tcPr>
+            <w:tcW w:type="dxa" w:w="7088"/>
+            <w:vAlign w:val="center"/>
+            <w:tcMar>
+              <w:top w:w="38" w:type="dxa"/>
+              <w:start w:w="70" w:type="dxa"/>
+              <w:bottom w:w="38" w:type="dxa"/>
+              <w:end w:w="70" w:type="dxa"/>
+            </w:tcMar>
+            <w:tcBorders>
+              <w:top w:val="single" w:sz="6" w:space="0" w:color="D9D9D9"/>
+              <w:left w:val="single" w:sz="6" w:space="0" w:color="D9D9D9"/>
+              <w:bottom w:val="single" w:sz="6" w:space="0" w:color="D9D9D9"/>
+              <w:right w:val="single" w:sz="6" w:space="0" w:color="D9D9D9"/>
+              <w:insideH w:val="single" w:sz="6" w:space="0" w:color="D9D9D9"/>
+              <w:insideV w:val="single" w:sz="6" w:space="0" w:color="D9D9D9"/>
+            </w:tcBorders>
+          </w:tcPr>
+          <w:p>
+            <w:pPr>
+              <w:spacing w:after="0" w:line="252" w:lineRule="auto"/>
+              <w:jc w:val="left"/>
+            </w:pPr>
+            <w:r>
+              <w:rPr>
+                <w:rFonts w:ascii="Microsoft YaHei" w:hAnsi="Microsoft YaHei" w:eastAsia="Microsoft YaHei"/>
+                <w:color w:val="000000"/>
+                <w:sz w:val="17"/>
+              </w:rPr>
+              <w:t>建立「材料 2」独立提交件底稿：整体设计思路、Agent 配置完整细节、Skill 分层编排、调试迭代经验、示例问答截图索引、随附文件说明、托管平台状态与恢复路径、诚实边界</w:t>
+            </w:r>
+          </w:p>
+        </w:tc>
+        <w:tc>
+          <w:tcPr>
+            <w:tcW w:type="dxa" w:w="1152"/>
+            <w:vAlign w:val="center"/>
+            <w:tcMar>
+              <w:top w:w="38" w:type="dxa"/>
+              <w:start w:w="70" w:type="dxa"/>
+              <w:bottom w:w="38" w:type="dxa"/>
+              <w:end w:w="70" w:type="dxa"/>
+            </w:tcMar>
+            <w:tcBorders>
+              <w:top w:val="single" w:sz="6" w:space="0" w:color="D9D9D9"/>
+              <w:left w:val="single" w:sz="6" w:space="0" w:color="D9D9D9"/>
+              <w:bottom w:val="single" w:sz="6" w:space="0" w:color="D9D9D9"/>
+              <w:right w:val="single" w:sz="6" w:space="0" w:color="D9D9D9"/>
+              <w:insideH w:val="single" w:sz="6" w:space="0" w:color="D9D9D9"/>
+              <w:insideV w:val="single" w:sz="6" w:space="0" w:color="D9D9D9"/>
+            </w:tcBorders>
           </w:tcPr>
           <w:p>
             <w:pPr>

</xml_diff>